<commit_message>
updated number of sources required
</commit_message>
<xml_diff>
--- a/assignments/Project_2_Species_Interactions.docx
+++ b/assignments/Project_2_Species_Interactions.docx
@@ -7,6 +7,7 @@
         <w:pStyle w:val="Title"/>
         <w:rPr>
           <w:i w:val="1"/>
+          <w:iCs w:val="1"/>
         </w:rPr>
       </w:pPr>
       <w:bookmarkStart w:colFirst="0" w:colLast="0" w:name="_lbou0aq4mlyv" w:id="0"/>
@@ -45,7 +46,7 @@
         <w:rPr>
           <w:rtl w:val="0"/>
         </w:rPr>
-        <w:t xml:space="preserve">Students will investigate what is known about how interspecific interactions impact their study system (or a system of their choice) and prepare a review of around 3 pages in length. As before, the spatial and taxonomic scale are up to the students. For well-studied systems (e.g., all mammals globally), the work does not need to be exhaustive but if there are relatively few papers for the chosen subject (20 or fewer) then all of them should be included. Topics should be broad enough that students read between 10 and 20 papers. These assignments don’t need to focus on all known interactions for that study system, but rather students should pick one or more types of interaction that are especially interesting for them or important for the system. For example, a student working on flowering plants might choose to look at the role of interspecific competition, herbivory, or pollination.</w:t>
+        <w:t xml:space="preserve">Students will investigate what is known about how interspecific interactions impact their study system (or a system of their choice) and prepare a review of around 3 pages in length. As before, the spatial and taxonomic scale are up to the students. For well-studied systems (e.g., all mammals globally), the work does not need to be exhaustive but if there are relatively few papers for the chosen subject (10 or fewer) then all of them should be included. Topics should be broad enough that students read between 5 and 10 papers. These assignments don’t need to focus on all known interactions for that study system, but rather students should pick one or more types of interaction that are especially interesting for them or important for the system. For example, a student working on flowering plants might choose to look at the role of interspecific competition, herbivory, or pollination.</w:t>
       </w:r>
     </w:p>
     <w:p>
@@ -66,7 +67,7 @@
         <w:rPr>
           <w:rtl w:val="0"/>
         </w:rPr>
-        <w:t xml:space="preserve">Roughly 2 pages of your assignment should focus on what is known about the chosen type(s) of interaction(s) in your system, while the 3rd page should focus on how these interaction(s) impact spatial or temporal diversity patterns in your system. Placing interactions into the context of coexistence is encouraged. For example, you might discuss how species coexist despite negative interactions (e.g., competition, predation) or how coexistence is facilitated by positive interactions (e.g., mutualisms). You are free (and encouraged) to re-use text from Project 1, however references from Project 1 don’t count toward the required 10-20 papers (but still make sure to cite them), unless they deal explicitly with measuring or testing interactions.</w:t>
+        <w:t xml:space="preserve">Roughly 2 pages of your assignment should focus on what is known about the chosen type(s) of interaction(s) in your system, while the 3rd page should focus on how these interaction(s) impact spatial or temporal diversity patterns in your system. Placing interactions into the context of coexistence is encouraged. For example, you might discuss how species coexist despite negative interactions (e.g., competition, predation) or how coexistence is facilitated by positive interactions (e.g., mutualisms). You are free (and encouraged) to re-use text from Project 1, however references from Project 1 don’t count toward the required 5-10 papers (but still make sure to cite them), unless they deal explicitly with measuring or testing interactions.</w:t>
       </w:r>
     </w:p>
     <w:p>
@@ -208,6 +209,7 @@
       <w:r>
         <w:rPr>
           <w:i w:val="1"/>
+          <w:iCs w:val="1"/>
           <w:sz w:val="24"/>
           <w:szCs w:val="24"/>
           <w:rtl w:val="0"/>
@@ -238,7 +240,7 @@
           <w:szCs w:val="24"/>
           <w:rtl w:val="0"/>
         </w:rPr>
-        <w:t xml:space="preserve">At least ten papers were referenced in the text</w:t>
+        <w:t xml:space="preserve">At least five papers were referenced in the text</w:t>
         <w:tab/>
         <w:tab/>
         <w:t xml:space="preserve"> </w:t>
@@ -520,11 +522,19 @@
       </w:pPr>
     </w:pPrDefault>
   </w:docDefaults>
+  <w:style w:type="table" w:styleId="TableNormal" w:default="1">
+    <w:name w:val="TableNormal"/>
+    <w:tblPr>
+      <w:tblCellMar>
+        <w:top w:w="100.0" w:type="dxa"/>
+        <w:left w:w="100.0" w:type="dxa"/>
+        <w:bottom w:w="100.0" w:type="dxa"/>
+        <w:right w:w="100.0" w:type="dxa"/>
+      </w:tblCellMar>
+    </w:tblPr>
+  </w:style>
   <w:style w:type="paragraph" w:styleId="Normal" w:default="1">
     <w:name w:val="normal"/>
-  </w:style>
-  <w:style w:type="table" w:styleId="TableNormal" w:default="1">
-    <w:name w:val="Table Normal"/>
   </w:style>
   <w:style w:type="paragraph" w:styleId="Heading1">
     <w:name w:val="heading 1"/>
@@ -553,6 +563,7 @@
     </w:pPr>
     <w:rPr>
       <w:b w:val="0"/>
+      <w:bCs w:val="0"/>
       <w:sz w:val="32"/>
       <w:szCs w:val="32"/>
     </w:rPr>
@@ -569,6 +580,7 @@
     </w:pPr>
     <w:rPr>
       <w:b w:val="0"/>
+      <w:bCs w:val="0"/>
       <w:color w:val="434343"/>
       <w:sz w:val="28"/>
       <w:szCs w:val="28"/>
@@ -618,6 +630,7 @@
     </w:pPr>
     <w:rPr>
       <w:i w:val="1"/>
+      <w:iCs w:val="1"/>
       <w:color w:val="666666"/>
       <w:sz w:val="22"/>
       <w:szCs w:val="22"/>
@@ -651,6 +664,7 @@
     <w:rPr>
       <w:rFonts w:ascii="Arial" w:cs="Arial" w:eastAsia="Arial" w:hAnsi="Arial"/>
       <w:i w:val="0"/>
+      <w:iCs w:val="0"/>
       <w:color w:val="666666"/>
       <w:sz w:val="30"/>
       <w:szCs w:val="30"/>

</xml_diff>